<commit_message>
Charge the doc with the feedback
</commit_message>
<xml_diff>
--- a/Ciclo 1.docx
+++ b/Ciclo 1.docx
@@ -37,55 +37,27 @@
         <w:rPr>
           <w:rFonts w:ascii="Arial" w:hAnsi="Arial" w:cs="Arial"/>
         </w:rPr>
-        <w:t xml:space="preserve">¿Cuáles fueron los </w:t>
-      </w:r>
-      <w:proofErr w:type="spellStart"/>
-      <w:r>
-        <w:rPr>
-          <w:rFonts w:ascii="Arial" w:hAnsi="Arial" w:cs="Arial"/>
-        </w:rPr>
-        <w:t>mini-ciclos</w:t>
-      </w:r>
-      <w:proofErr w:type="spellEnd"/>
-      <w:r>
-        <w:rPr>
-          <w:rFonts w:ascii="Arial" w:hAnsi="Arial" w:cs="Arial"/>
-        </w:rPr>
-        <w:t xml:space="preserve"> definidos? Justifíquenlos.</w:t>
-      </w:r>
-    </w:p>
-    <w:p>
-      <w:pPr>
-        <w:rPr>
-          <w:rFonts w:ascii="Arial" w:hAnsi="Arial" w:cs="Arial"/>
-        </w:rPr>
-      </w:pPr>
-    </w:p>
-    <w:p>
-      <w:pPr>
-        <w:rPr>
-          <w:rFonts w:ascii="Arial" w:hAnsi="Arial" w:cs="Arial"/>
-        </w:rPr>
-      </w:pPr>
-      <w:r>
-        <w:rPr>
-          <w:rFonts w:ascii="Arial" w:hAnsi="Arial" w:cs="Arial"/>
-        </w:rPr>
-        <w:t xml:space="preserve">Establecimos 5 </w:t>
-      </w:r>
-      <w:proofErr w:type="spellStart"/>
-      <w:r>
-        <w:rPr>
-          <w:rFonts w:ascii="Arial" w:hAnsi="Arial" w:cs="Arial"/>
-        </w:rPr>
-        <w:t>mini-ciclos</w:t>
-      </w:r>
-      <w:proofErr w:type="spellEnd"/>
-      <w:r>
-        <w:rPr>
-          <w:rFonts w:ascii="Arial" w:hAnsi="Arial" w:cs="Arial"/>
-        </w:rPr>
-        <w:t>:</w:t>
+        <w:t>¿Cuáles fueron los mini-ciclos definidos? Justifíquenlos.</w:t>
+      </w:r>
+    </w:p>
+    <w:p>
+      <w:pPr>
+        <w:rPr>
+          <w:rFonts w:ascii="Arial" w:hAnsi="Arial" w:cs="Arial"/>
+        </w:rPr>
+      </w:pPr>
+    </w:p>
+    <w:p>
+      <w:pPr>
+        <w:rPr>
+          <w:rFonts w:ascii="Arial" w:hAnsi="Arial" w:cs="Arial"/>
+        </w:rPr>
+      </w:pPr>
+      <w:r>
+        <w:rPr>
+          <w:rFonts w:ascii="Arial" w:hAnsi="Arial" w:cs="Arial"/>
+        </w:rPr>
+        <w:t>Establecimos 5 mini-ciclos:</w:t>
       </w:r>
     </w:p>
     <w:p>
@@ -121,21 +93,7 @@
         <w:rPr>
           <w:rFonts w:ascii="Arial" w:hAnsi="Arial" w:cs="Arial"/>
         </w:rPr>
-        <w:t>Adición y eliminación de ruedas y símbolos: definir estas dos clases con sus constructores y métodos necesarios para poder adicionar estos objetos a las estructuras de datos (</w:t>
-      </w:r>
-      <w:proofErr w:type="spellStart"/>
-      <w:r>
-        <w:rPr>
-          <w:rFonts w:ascii="Arial" w:hAnsi="Arial" w:cs="Arial"/>
-        </w:rPr>
-        <w:t>TreeMap</w:t>
-      </w:r>
-      <w:proofErr w:type="spellEnd"/>
-      <w:r>
-        <w:rPr>
-          <w:rFonts w:ascii="Arial" w:hAnsi="Arial" w:cs="Arial"/>
-        </w:rPr>
-        <w:t>) respectivas.</w:t>
+        <w:t>Adición y eliminación de ruedas y símbolos: definir estas dos clases con sus constructores y métodos necesarios para poder adicionar estos objetos a las estructuras de datos (TreeMap) respectivas.</w:t>
       </w:r>
     </w:p>
     <w:p>
@@ -177,21 +135,7 @@
         <w:rPr>
           <w:rFonts w:ascii="Arial" w:hAnsi="Arial" w:cs="Arial"/>
         </w:rPr>
-        <w:t xml:space="preserve">Consulta de datos de la máquina: creación de los métodos para saber los posibles símbolos que hay, para saber la cantidad de símbolos distintos entre las ruedas, para saber los símbolos que hay en cada rueda de manera ordenada y para saber si se logro el </w:t>
-      </w:r>
-      <w:proofErr w:type="spellStart"/>
-      <w:r>
-        <w:rPr>
-          <w:rFonts w:ascii="Arial" w:hAnsi="Arial" w:cs="Arial"/>
-        </w:rPr>
-        <w:t>jackpot</w:t>
-      </w:r>
-      <w:proofErr w:type="spellEnd"/>
-      <w:r>
-        <w:rPr>
-          <w:rFonts w:ascii="Arial" w:hAnsi="Arial" w:cs="Arial"/>
-        </w:rPr>
-        <w:t xml:space="preserve"> (es decir que todos los símbolos sean iguales, que significa que solo hay 1 símbolo distinto)</w:t>
+        <w:t>Consulta de datos de la máquina: creación de los métodos para saber los posibles símbolos que hay, para saber la cantidad de símbolos distintos entre las ruedas, para saber los símbolos que hay en cada rueda de manera ordenada y para saber si se logro el jackpot (es decir que todos los símbolos sean iguales, que significa que solo hay 1 símbolo distinto)</w:t>
       </w:r>
     </w:p>
     <w:p>
@@ -222,35 +166,7 @@
         <w:rPr>
           <w:rFonts w:ascii="Arial" w:hAnsi="Arial" w:cs="Arial"/>
         </w:rPr>
-        <w:t xml:space="preserve">Establecimos estos </w:t>
-      </w:r>
-      <w:proofErr w:type="spellStart"/>
-      <w:r>
-        <w:rPr>
-          <w:rFonts w:ascii="Arial" w:hAnsi="Arial" w:cs="Arial"/>
-        </w:rPr>
-        <w:t>mini-ciclos</w:t>
-      </w:r>
-      <w:proofErr w:type="spellEnd"/>
-      <w:r>
-        <w:rPr>
-          <w:rFonts w:ascii="Arial" w:hAnsi="Arial" w:cs="Arial"/>
-        </w:rPr>
-        <w:t xml:space="preserve"> debido a que nos permite repartir de forma equilibrada los métodos propuestos para la clase </w:t>
-      </w:r>
-      <w:proofErr w:type="spellStart"/>
-      <w:r>
-        <w:rPr>
-          <w:rFonts w:ascii="Arial" w:hAnsi="Arial" w:cs="Arial"/>
-        </w:rPr>
-        <w:t>SlotMachine</w:t>
-      </w:r>
-      <w:proofErr w:type="spellEnd"/>
-      <w:r>
-        <w:rPr>
-          <w:rFonts w:ascii="Arial" w:hAnsi="Arial" w:cs="Arial"/>
-        </w:rPr>
-        <w:t xml:space="preserve"> además que están separados según las funciones que </w:t>
+        <w:t xml:space="preserve">Establecimos estos mini-ciclos debido a que nos permite repartir de forma equilibrada los métodos propuestos para la clase SlotMachine además que están separados según las funciones que </w:t>
       </w:r>
       <w:r>
         <w:rPr>
@@ -438,36 +354,21 @@
           <w:rFonts w:ascii="Arial" w:hAnsi="Arial" w:cs="Arial"/>
         </w:rPr>
         <w:lastRenderedPageBreak/>
-        <w:t xml:space="preserve">¿Cuál es el estado actual del proyecto en términos de </w:t>
-      </w:r>
-      <w:proofErr w:type="spellStart"/>
-      <w:r>
-        <w:rPr>
-          <w:rFonts w:ascii="Arial" w:hAnsi="Arial" w:cs="Arial"/>
-        </w:rPr>
-        <w:t>mini-ciclos</w:t>
-      </w:r>
-      <w:proofErr w:type="spellEnd"/>
-      <w:r>
-        <w:rPr>
-          <w:rFonts w:ascii="Arial" w:hAnsi="Arial" w:cs="Arial"/>
-        </w:rPr>
-        <w:t>? ¿por qué?</w:t>
-      </w:r>
-    </w:p>
-    <w:p>
-      <w:pPr>
-        <w:rPr>
-          <w:rFonts w:ascii="Arial" w:hAnsi="Arial" w:cs="Arial"/>
-        </w:rPr>
-      </w:pPr>
-    </w:p>
-    <w:p>
-      <w:pPr>
-        <w:rPr>
-          <w:rFonts w:ascii="Arial" w:hAnsi="Arial" w:cs="Arial"/>
-        </w:rPr>
-      </w:pPr>
+        <w:t>¿Cuál es el estado actual del proyecto en términos de mini-ciclos? ¿por qué?</w:t>
+      </w:r>
+    </w:p>
+    <w:p>
+      <w:pPr>
+        <w:rPr>
+          <w:rFonts w:ascii="Arial" w:hAnsi="Arial" w:cs="Arial"/>
+        </w:rPr>
+      </w:pPr>
+      <w:r>
+        <w:rPr>
+          <w:rFonts w:ascii="Arial" w:hAnsi="Arial" w:cs="Arial"/>
+        </w:rPr>
+        <w:t>El estado actual, en términos de mini-ciclos, se encuentra totalmente terminado, cumpliendo la organización propuesta en los mini-ciclos.</w:t>
+      </w:r>
     </w:p>
     <w:p>
       <w:pPr>
@@ -545,13 +446,12 @@
           <w:rFonts w:ascii="Arial" w:hAnsi="Arial" w:cs="Arial"/>
         </w:rPr>
       </w:pPr>
-    </w:p>
-    <w:p>
-      <w:pPr>
-        <w:rPr>
-          <w:rFonts w:ascii="Arial" w:hAnsi="Arial" w:cs="Arial"/>
-        </w:rPr>
-      </w:pPr>
+      <w:r>
+        <w:rPr>
+          <w:rFonts w:ascii="Arial" w:hAnsi="Arial" w:cs="Arial"/>
+        </w:rPr>
+        <w:t>El mayor logro en general es todo el aprendizaje que estamos adquiriendo mediante estos proyectos, para así tener mas herramientas para solucionar diversos problemas de la materia y a priori.</w:t>
+      </w:r>
     </w:p>
     <w:p>
       <w:pPr>
@@ -575,34 +475,21 @@
         <w:rPr>
           <w:rFonts w:ascii="Arial" w:hAnsi="Arial" w:cs="Arial"/>
         </w:rPr>
-        <w:t>¿Cuál consideran que fue el mayor problema técnico? ¿Qué hicieron para</w:t>
-      </w:r>
-      <w:r>
-        <w:rPr>
-          <w:rFonts w:ascii="Arial" w:hAnsi="Arial" w:cs="Arial"/>
-        </w:rPr>
-        <w:t xml:space="preserve"> </w:t>
-      </w:r>
-      <w:r>
-        <w:rPr>
-          <w:rFonts w:ascii="Arial" w:hAnsi="Arial" w:cs="Arial"/>
-        </w:rPr>
-        <w:t>resolverlo?</w:t>
-      </w:r>
-    </w:p>
-    <w:p>
-      <w:pPr>
-        <w:rPr>
-          <w:rFonts w:ascii="Arial" w:hAnsi="Arial" w:cs="Arial"/>
-        </w:rPr>
-      </w:pPr>
-    </w:p>
-    <w:p>
-      <w:pPr>
-        <w:rPr>
-          <w:rFonts w:ascii="Arial" w:hAnsi="Arial" w:cs="Arial"/>
-        </w:rPr>
-      </w:pPr>
+        <w:t>¿Cuál consideran que fue el mayor problema técnico? ¿Qué hicieron para resolverlo?</w:t>
+      </w:r>
+    </w:p>
+    <w:p>
+      <w:pPr>
+        <w:rPr>
+          <w:rFonts w:ascii="Arial" w:hAnsi="Arial" w:cs="Arial"/>
+        </w:rPr>
+      </w:pPr>
+      <w:r>
+        <w:rPr>
+          <w:rFonts w:ascii="Arial" w:hAnsi="Arial" w:cs="Arial"/>
+        </w:rPr>
+        <w:t>El mayor problema técnico esta intrínsecamente relacionado con el desconocimiento que tenemos al momento de realizar estos proyectos, para resolverlo, aprendemos cada vez más cosas para solucionar estos problemas.</w:t>
+      </w:r>
     </w:p>
     <w:p>
       <w:pPr>
@@ -635,6 +522,18 @@
           <w:rFonts w:ascii="Arial" w:hAnsi="Arial" w:cs="Arial"/>
         </w:rPr>
       </w:pPr>
+      <w:r>
+        <w:rPr>
+          <w:rFonts w:ascii="Arial" w:hAnsi="Arial" w:cs="Arial"/>
+        </w:rPr>
+        <w:t>Como equipo,</w:t>
+      </w:r>
+      <w:r>
+        <w:rPr>
+          <w:rFonts w:ascii="Arial" w:hAnsi="Arial" w:cs="Arial"/>
+        </w:rPr>
+        <w:t xml:space="preserve"> logramos dividir de forma efectiva como íbamos a llevar a cabo el proyecto, sin embargo, nos comprometemos a ser mas rigurosos con esta organización para mejorar la calidad de los siguientes entregables.</w:t>
+      </w:r>
     </w:p>
     <w:p>
       <w:pPr>
@@ -674,13 +573,30 @@
           <w:rFonts w:ascii="Arial" w:hAnsi="Arial" w:cs="Arial"/>
         </w:rPr>
       </w:pPr>
-    </w:p>
-    <w:p>
-      <w:pPr>
-        <w:rPr>
-          <w:rFonts w:ascii="Arial" w:hAnsi="Arial" w:cs="Arial"/>
-        </w:rPr>
-      </w:pPr>
+      <w:r>
+        <w:rPr>
+          <w:rFonts w:ascii="Arial" w:hAnsi="Arial" w:cs="Arial"/>
+        </w:rPr>
+        <w:t>La práctica XP más útil es “</w:t>
+      </w:r>
+      <w:r>
+        <w:rPr>
+          <w:rFonts w:ascii="Arial" w:hAnsi="Arial" w:cs="Arial"/>
+        </w:rPr>
+        <w:t>The project is divided into iterations</w:t>
+      </w:r>
+      <w:r>
+        <w:rPr>
+          <w:rFonts w:ascii="Arial" w:hAnsi="Arial" w:cs="Arial"/>
+        </w:rPr>
+        <w:t>”, debido a que dividiendo el problema e</w:t>
+      </w:r>
+      <w:r>
+        <w:rPr>
+          <w:rFonts w:ascii="Arial" w:hAnsi="Arial" w:cs="Arial"/>
+        </w:rPr>
+        <w:t>n iteraciones, por ejemplo los mini-ciclos, se es más fácil llegar al objetivo de manera eficaz</w:t>
+      </w:r>
     </w:p>
     <w:p>
       <w:pPr>
@@ -724,57 +640,36 @@
         <w:rPr>
           <w:rFonts w:ascii="Arial" w:hAnsi="Arial" w:cs="Arial"/>
         </w:rPr>
-        <w:t xml:space="preserve">Consideramos que la documentación de Oracle para el uso de </w:t>
-      </w:r>
-      <w:proofErr w:type="spellStart"/>
-      <w:r>
-        <w:rPr>
-          <w:rFonts w:ascii="Arial" w:hAnsi="Arial" w:cs="Arial"/>
-        </w:rPr>
-        <w:t>TreeMap</w:t>
-      </w:r>
-      <w:proofErr w:type="spellEnd"/>
-      <w:r>
-        <w:rPr>
-          <w:rFonts w:ascii="Arial" w:hAnsi="Arial" w:cs="Arial"/>
-        </w:rPr>
-        <w:t xml:space="preserve"> fue lo más útil debido a que gracias a el pudimos guardar los objetos que necesitábamos usando esta estructura de datos.</w:t>
-      </w:r>
-    </w:p>
-    <w:p>
-      <w:pPr>
-        <w:rPr>
-          <w:rFonts w:ascii="Arial" w:hAnsi="Arial" w:cs="Arial"/>
-        </w:rPr>
-      </w:pPr>
-    </w:p>
-    <w:p>
-      <w:pPr>
-        <w:rPr>
-          <w:rFonts w:ascii="Arial" w:hAnsi="Arial" w:cs="Arial"/>
-        </w:rPr>
-      </w:pPr>
-    </w:p>
-    <w:p>
-      <w:pPr>
-        <w:rPr>
-          <w:rFonts w:ascii="Arial" w:hAnsi="Arial" w:cs="Arial"/>
-        </w:rPr>
-      </w:pPr>
-      <w:proofErr w:type="spellStart"/>
-      <w:r>
-        <w:rPr>
-          <w:rFonts w:ascii="Arial" w:hAnsi="Arial" w:cs="Arial"/>
-        </w:rPr>
-        <w:lastRenderedPageBreak/>
-        <w:t>Chacon</w:t>
-      </w:r>
-      <w:proofErr w:type="spellEnd"/>
-      <w:r>
-        <w:rPr>
-          <w:rFonts w:ascii="Arial" w:hAnsi="Arial" w:cs="Arial"/>
-        </w:rPr>
-        <w:t xml:space="preserve">, S., &amp; Straub, B. (2014). </w:t>
+        <w:t>Consideramos que la documentación de Oracle para el uso de TreeMap fue lo más útil debido a que gracias a el pudimos guardar los objetos que necesitábamos usando esta estructura de datos.</w:t>
+      </w:r>
+    </w:p>
+    <w:p>
+      <w:pPr>
+        <w:rPr>
+          <w:rFonts w:ascii="Arial" w:hAnsi="Arial" w:cs="Arial"/>
+        </w:rPr>
+      </w:pPr>
+    </w:p>
+    <w:p>
+      <w:pPr>
+        <w:rPr>
+          <w:rFonts w:ascii="Arial" w:hAnsi="Arial" w:cs="Arial"/>
+        </w:rPr>
+      </w:pPr>
+    </w:p>
+    <w:p>
+      <w:pPr>
+        <w:rPr>
+          <w:rFonts w:ascii="Arial" w:hAnsi="Arial" w:cs="Arial"/>
+          <w:lang w:val="en-US"/>
+        </w:rPr>
+      </w:pPr>
+      <w:r>
+        <w:rPr>
+          <w:rFonts w:ascii="Arial" w:hAnsi="Arial" w:cs="Arial"/>
+          <w:lang w:val="en-US"/>
+        </w:rPr>
+        <w:t xml:space="preserve">Chacon, S., &amp; Straub, B. (2014). </w:t>
       </w:r>
       <w:r>
         <w:rPr>
@@ -790,23 +685,7 @@
           <w:rFonts w:ascii="Arial" w:hAnsi="Arial" w:cs="Arial"/>
           <w:lang w:val="en-GB"/>
         </w:rPr>
-        <w:t xml:space="preserve"> (2nd ed.). </w:t>
-      </w:r>
-      <w:proofErr w:type="spellStart"/>
-      <w:r>
-        <w:rPr>
-          <w:rFonts w:ascii="Arial" w:hAnsi="Arial" w:cs="Arial"/>
-          <w:lang w:val="en-GB"/>
-        </w:rPr>
-        <w:t>Apress</w:t>
-      </w:r>
-      <w:proofErr w:type="spellEnd"/>
-      <w:r>
-        <w:rPr>
-          <w:rFonts w:ascii="Arial" w:hAnsi="Arial" w:cs="Arial"/>
-          <w:lang w:val="en-GB"/>
-        </w:rPr>
-        <w:t xml:space="preserve">. </w:t>
+        <w:t xml:space="preserve"> (2nd ed.). Apress. </w:t>
       </w:r>
       <w:hyperlink r:id="rId7" w:tgtFrame="_blank" w:history="1">
         <w:r>
@@ -823,75 +702,38 @@
       <w:pPr>
         <w:rPr>
           <w:rFonts w:ascii="Arial" w:hAnsi="Arial" w:cs="Arial"/>
-        </w:rPr>
-      </w:pPr>
-      <w:r>
-        <w:rPr>
-          <w:rFonts w:ascii="Arial" w:hAnsi="Arial" w:cs="Arial"/>
+          <w:lang w:val="en-US"/>
+        </w:rPr>
+      </w:pPr>
+      <w:r>
+        <w:rPr>
+          <w:rFonts w:ascii="Arial" w:hAnsi="Arial" w:cs="Arial"/>
+          <w:lang w:val="en-US"/>
         </w:rPr>
         <w:t xml:space="preserve">Oracle. (s. f.). </w:t>
       </w:r>
-      <w:proofErr w:type="spellStart"/>
       <w:r>
         <w:rPr>
           <w:rFonts w:ascii="Arial" w:hAnsi="Arial" w:cs="Arial"/>
           <w:i/>
           <w:iCs/>
-        </w:rPr>
-        <w:t>TreeMap</w:t>
-      </w:r>
-      <w:proofErr w:type="spellEnd"/>
-      <w:r>
-        <w:rPr>
-          <w:rFonts w:ascii="Arial" w:hAnsi="Arial" w:cs="Arial"/>
-          <w:i/>
-          <w:iCs/>
-        </w:rPr>
-        <w:t xml:space="preserve"> (Java </w:t>
-      </w:r>
-      <w:proofErr w:type="spellStart"/>
-      <w:r>
-        <w:rPr>
-          <w:rFonts w:ascii="Arial" w:hAnsi="Arial" w:cs="Arial"/>
-          <w:i/>
-          <w:iCs/>
-        </w:rPr>
-        <w:t>Platform</w:t>
-      </w:r>
-      <w:proofErr w:type="spellEnd"/>
-      <w:r>
-        <w:rPr>
-          <w:rFonts w:ascii="Arial" w:hAnsi="Arial" w:cs="Arial"/>
-          <w:i/>
-          <w:iCs/>
-        </w:rPr>
-        <w:t xml:space="preserve"> SE 17)</w:t>
-      </w:r>
-      <w:r>
-        <w:rPr>
-          <w:rFonts w:ascii="Arial" w:hAnsi="Arial" w:cs="Arial"/>
-        </w:rPr>
-        <w:t xml:space="preserve">. Oracle </w:t>
-      </w:r>
-      <w:proofErr w:type="spellStart"/>
-      <w:r>
-        <w:rPr>
-          <w:rFonts w:ascii="Arial" w:hAnsi="Arial" w:cs="Arial"/>
-        </w:rPr>
-        <w:t>Documentation</w:t>
-      </w:r>
-      <w:proofErr w:type="spellEnd"/>
-      <w:r>
-        <w:rPr>
-          <w:rFonts w:ascii="Arial" w:hAnsi="Arial" w:cs="Arial"/>
-        </w:rPr>
-        <w:t xml:space="preserve">. </w:t>
+          <w:lang w:val="en-US"/>
+        </w:rPr>
+        <w:t>TreeMap (Java Platform SE 17)</w:t>
+      </w:r>
+      <w:r>
+        <w:rPr>
+          <w:rFonts w:ascii="Arial" w:hAnsi="Arial" w:cs="Arial"/>
+          <w:lang w:val="en-US"/>
+        </w:rPr>
+        <w:t xml:space="preserve">. Oracle Documentation. </w:t>
       </w:r>
       <w:hyperlink r:id="rId8" w:tgtFrame="_blank" w:history="1">
         <w:r>
           <w:rPr>
             <w:rStyle w:val="Hipervnculo"/>
             <w:rFonts w:ascii="Arial" w:hAnsi="Arial" w:cs="Arial"/>
+            <w:lang w:val="en-US"/>
           </w:rPr>
           <w:t>https://docs.oracle.com/en/java/javase/17/docs/api/java.base/java/util/TreeMap.html</w:t>
         </w:r>

</xml_diff>